<commit_message>
F0L(lead): M09 verdict REMOVED_BY_SOURCE_CLEANUP — coverage tool thêm final status + SECTION_STATUSES whitelist + override/manifest đồng bộ; p2a pin premise-chết chuyển sang pin decontam (14/0)
</commit_message>
<xml_diff>
--- a/app/templates/PLI_M09.docx
+++ b/app/templates/PLI_M09.docx
@@ -2515,183 +2515,6 @@
           <w:sz-cs w:val="24"/>
         </w:rPr>
         <w:t xml:space="preserve">- Các thành viên hợp danh của công ty ký trực tiếp vào phần này. </w:t>
-      </w:r>
-    </w:p>
-    <w:p>
-      <w:pPr>
-        <w:jc w:val="center"/>
-        <w:spacing w:before="120"/>
-      </w:pPr>
-      <w:r>
-        <w:rPr>
-          <w:rFonts w:ascii="Arial" w:hAnsi="Arial" w:cs="Arial"/>
-          <w:sz w:val="24"/>
-          <w:sz-cs w:val="24"/>
-          <w:i/>
-        </w:rPr>
-        <w:t xml:space="preserve"/>
-      </w:r>
-    </w:p>
-    <w:p>
-      <w:pPr>
-        <w:spacing w:before="120"/>
-      </w:pPr>
-      <w:r>
-        <w:rPr>
-          <w:rFonts w:ascii="Arial" w:hAnsi="Arial" w:cs="Arial"/>
-          <w:sz w:val="24"/>
-          <w:sz-cs w:val="24"/>
-        </w:rPr>
-        <w:t xml:space="preserve">__________________________</w:t>
-      </w:r>
-    </w:p>
-    <w:p>
-      <w:pPr>
-        <w:spacing w:before="120"/>
-      </w:pPr>
-      <w:r>
-        <w:rPr>
-          <w:rFonts w:ascii="Arial" w:hAnsi="Arial" w:cs="Arial"/>
-          <w:sz w:val="24"/>
-          <w:sz-cs w:val="24"/>
-        </w:rPr>
-        <w:t xml:space="preserve"/>
-      </w:r>
-    </w:p>
-    <w:p>
-      <w:pPr>
-        <w:spacing w:before="120"/>
-      </w:pPr>
-      <w:r>
-        <w:rPr>
-          <w:rFonts w:ascii="Arial" w:hAnsi="Arial" w:cs="Arial"/>
-          <w:sz w:val="24"/>
-          <w:sz-cs w:val="24"/>
-        </w:rPr>
-        <w:t xml:space="preserve"/>
-      </w:r>
-    </w:p>
-    <w:p>
-      <w:pPr>
-        <w:spacing w:before="120"/>
-      </w:pPr>
-      <w:r>
-        <w:rPr>
-          <w:rFonts w:ascii="Arial" w:hAnsi="Arial" w:cs="Arial"/>
-          <w:sz w:val="24"/>
-          <w:sz-cs w:val="24"/>
-        </w:rPr>
-        <w:t xml:space="preserve">_________________________</w:t>
-      </w:r>
-    </w:p>
-    <w:p>
-      <w:pPr>
-        <w:spacing w:before="120"/>
-      </w:pPr>
-      <w:r>
-        <w:rPr>
-          <w:rFonts w:ascii="Arial" w:hAnsi="Arial" w:cs="Arial"/>
-          <w:sz w:val="24"/>
-          <w:sz-cs w:val="24"/>
-          <w:b/>
-        </w:rPr>
-        <w:t xml:space="preserve"/>
-      </w:r>
-    </w:p>
-    <w:p>
-      <w:pPr>
-        <w:spacing w:before="120"/>
-      </w:pPr>
-      <w:r>
-        <w:rPr>
-          <w:rFonts w:ascii="Arial" w:hAnsi="Arial" w:cs="Arial"/>
-          <w:sz w:val="24"/>
-          <w:sz-cs w:val="24"/>
-        </w:rPr>
-        <w:t xml:space="preserve"/>
-      </w:r>
-    </w:p>
-    <w:p>
-      <w:pPr>
-        <w:spacing w:before="120"/>
-      </w:pPr>
-      <w:r>
-        <w:rPr>
-          <w:rFonts w:ascii="Arial" w:hAnsi="Arial" w:cs="Arial"/>
-          <w:sz w:val="24"/>
-          <w:sz-cs w:val="24"/>
-        </w:rPr>
-        <w:t xml:space="preserve">_________________________</w:t>
-      </w:r>
-    </w:p>
-    <w:p>
-      <w:pPr>
-        <w:spacing w:before="120"/>
-      </w:pPr>
-      <w:r>
-        <w:rPr>
-          <w:rFonts w:ascii="Arial" w:hAnsi="Arial" w:cs="Arial"/>
-          <w:sz w:val="24"/>
-          <w:sz-cs w:val="24"/>
-          <w:b/>
-        </w:rPr>
-        <w:t xml:space="preserve"/>
-      </w:r>
-    </w:p>
-    <w:p>
-      <w:pPr>
-        <w:spacing w:before="120"/>
-      </w:pPr>
-      <w:r>
-        <w:rPr>
-          <w:rFonts w:ascii="Arial" w:hAnsi="Arial" w:cs="Arial"/>
-          <w:sz w:val="24"/>
-          <w:sz-cs w:val="24"/>
-          <w:b/>
-        </w:rPr>
-        <w:t xml:space="preserve"/>
-      </w:r>
-    </w:p>
-    <w:p>
-      <w:pPr>
-        <w:jc w:val="center"/>
-        <w:spacing w:before="120"/>
-      </w:pPr>
-      <w:r>
-        <w:rPr>
-          <w:rFonts w:ascii="Arial" w:hAnsi="Arial" w:cs="Arial"/>
-          <w:sz w:val="24"/>
-          <w:sz-cs w:val="24"/>
-          <w:i/>
-        </w:rPr>
-        <w:t xml:space="preserve"/>
-      </w:r>
-    </w:p>
-    <w:p>
-      <w:pPr>
-        <w:spacing w:before="120"/>
-      </w:pPr>
-      <w:r>
-        <w:rPr>
-          <w:rFonts w:ascii="Arial" w:hAnsi="Arial" w:cs="Arial"/>
-          <w:sz w:val="24"/>
-          <w:sz-cs w:val="24"/>
-        </w:rPr>
-        <w:t xml:space="preserve">______________________</w:t>
-      </w:r>
-    </w:p>
-    <w:p>
-      <w:pPr>
-        <w:spacing w:before="120"/>
-      </w:pPr>
-      <w:r>
-        <w:rPr>
-          <w:rFonts w:ascii="Arial" w:hAnsi="Arial" w:cs="Arial"/>
-          <w:sz w:val="24"/>
-          <w:sz-cs w:val="24"/>
-          <w:b/>
-        </w:rPr>
-        <w:t xml:space="preserve"/>
       </w:r>
     </w:p>
     <w:sectPr>

</xml_diff>